<commit_message>
docs: completar borrador verificable de la rubrica final
</commit_message>
<xml_diff>
--- a/entrega/Evidencias_EntregaFinal_en_progreso.docx
+++ b/entrega/Evidencias_EntregaFinal_en_progreso.docx
@@ -378,7 +378,7 @@
                 <w:sz w:val="19"/>
                 <w:szCs w:val="19"/>
               </w:rPr>
-              <w:t>https://github.com/oft24/Proyecto-Final-Herramientas-de-tecnolog-as-de-la-informaci-n (commit de remediación pendiente)</w:t>
+              <w:t>https://github.com/oft24/Proyecto-Final-Herramientas-de-tecnolog-as-de-la-informaci-n (remediación 56b06f5)</w:t>
             </w:r>
           </w:p>
         </w:tc>
@@ -1706,7 +1706,7 @@
                 <w:sz w:val="19"/>
                 <w:szCs w:val="19"/>
               </w:rPr>
-              <w:t>Pendiente: integrar primero el parche en la EC2 de QA y demostrar el endpoint.</w:t>
+              <w:t>Pendiente: reproducir el parche en la EC2 QA heredada; la integración y prueba roja actuales son locales.</w:t>
             </w:r>
           </w:p>
         </w:tc>
@@ -1804,7 +1804,7 @@
                 <w:sz w:val="19"/>
                 <w:szCs w:val="19"/>
               </w:rPr>
-              <w:t>Pendiente: ejecutar el pipeline en QA sobre el parche sin remediar y guardar la salida real.</w:t>
+              <w:t>Pendiente: repetir en QA el bloqueo real. Localmente fallaron dos pruebas y la decisión fue BLOQUEADO.</w:t>
             </w:r>
           </w:p>
         </w:tc>
@@ -1871,7 +1871,7 @@
                 <w:sz w:val="19"/>
                 <w:szCs w:val="19"/>
               </w:rPr>
-              <w:t>[  ]</w:t>
+              <w:t>[X]</w:t>
             </w:r>
           </w:p>
         </w:tc>
@@ -1902,7 +1902,7 @@
                 <w:sz w:val="19"/>
                 <w:szCs w:val="19"/>
               </w:rPr>
-              <w:t>Pendiente: confirmar el hallazgo con una prueba y documentar tipo, severidad y falso positivo.</w:t>
+              <w:t>Clasificación local en docs/clasificacion_hallazgo.md; falta correlacionar con salida QA.</w:t>
             </w:r>
           </w:p>
         </w:tc>
@@ -1969,7 +1969,7 @@
                 <w:sz w:val="19"/>
                 <w:szCs w:val="19"/>
               </w:rPr>
-              <w:t>[  ]</w:t>
+              <w:t>[X]</w:t>
             </w:r>
           </w:p>
         </w:tc>
@@ -2000,7 +2000,7 @@
                 <w:sz w:val="19"/>
                 <w:szCs w:val="19"/>
               </w:rPr>
-              <w:t>Pendiente: documentar por separado una contención aplicada y el arreglo preventivo.</w:t>
+              <w:t>Contención local y prevención separadas en docs/respuesta_incidente.md; comprobar contención QA.</w:t>
             </w:r>
           </w:p>
         </w:tc>
@@ -2067,7 +2067,7 @@
                 <w:sz w:val="19"/>
                 <w:szCs w:val="19"/>
               </w:rPr>
-              <w:t>[  ]</w:t>
+              <w:t>[X]</w:t>
             </w:r>
           </w:p>
         </w:tc>
@@ -2098,7 +2098,7 @@
                 <w:sz w:val="19"/>
                 <w:szCs w:val="19"/>
               </w:rPr>
-              <w:t>Pendiente: corregir la autorización sin quitar la funcionalidad de reenvío.</w:t>
+              <w:t>Autorización corregida y probada localmente; falta prueba de extremo a extremo en QA.</w:t>
             </w:r>
           </w:p>
         </w:tc>
@@ -2196,7 +2196,7 @@
                 <w:sz w:val="19"/>
                 <w:szCs w:val="19"/>
               </w:rPr>
-              <w:t>Pendiente: ejecutar de nuevo el pipeline completo en QA y guardar la salida verde.</w:t>
+              <w:t>Pendiente: repetir en QA la corrida verde local sobre el mismo commit corregido.</w:t>
             </w:r>
           </w:p>
         </w:tc>
@@ -2294,7 +2294,7 @@
                 <w:sz w:val="19"/>
                 <w:szCs w:val="19"/>
               </w:rPr>
-              <w:t>Pendiente: crear una EC2 nueva de Producción y desplegar solo el commit aprobado.</w:t>
+              <w:t>Pendiente: crear la EC2 nueva solo tras QA verde y documentar su despliegue.</w:t>
             </w:r>
           </w:p>
         </w:tc>
@@ -2368,7 +2368,7 @@
         <w:pBdr>
           <w:bottom w:val="single" w:color="C0C0C0" w:sz="4" w:space="4"/>
         </w:pBdr>
-        <w:spacing w:after="220" w:line="276"/>
+        <w:spacing w:after="120" w:line="276"/>
       </w:pPr>
       <w:r>
         <w:rPr>
@@ -2379,7 +2379,7 @@
           <w:sz w:val="21"/>
           <w:szCs w:val="21"/>
         </w:rPr>
-        <w:t>Análisis preliminar: el parche consulta un pedido por ID y permite solicitar el reenvío sin comprobar si la persona autenticada es su propietaria.</w:t>
+        <w:t>El parche permitía pedir el reenvío con un código de pedido sin verificar sesión ni propietario. En la prueba local, otro usuario y una persona anónima recibieron 202 en vez de 404 y 401.</w:t>
       </w:r>
     </w:p>
     <w:p>
@@ -2387,7 +2387,7 @@
         <w:pBdr>
           <w:bottom w:val="single" w:color="C0C0C0" w:sz="4" w:space="4"/>
         </w:pBdr>
-        <w:spacing w:after="220" w:line="276"/>
+        <w:spacing w:after="120" w:line="276"/>
       </w:pPr>
       <w:r>
         <w:rPr>
@@ -2398,7 +2398,7 @@
           <w:sz w:val="21"/>
           <w:szCs w:val="21"/>
         </w:rPr>
-        <w:t>Esto apunta a control de acceso roto a nivel de objeto (CWE-639). La clasificación definitiva depende de la prueba en QA; todavía no afirmo que Bandit lo haya detectado.</w:t>
+        <w:t>Es control de acceso roto a nivel de objeto (CWE-639). La prueba de autorización, no Bandit, detectó el defecto y detuvo el pipeline local. Falta repetirla en QA.</w:t>
       </w:r>
     </w:p>
     <w:p>
@@ -2423,7 +2423,7 @@
         <w:pBdr>
           <w:bottom w:val="single" w:color="C0C0C0" w:sz="4" w:space="4"/>
         </w:pBdr>
-        <w:spacing w:after="220" w:line="276"/>
+        <w:spacing w:after="120" w:line="276"/>
       </w:pPr>
       <w:r>
         <w:rPr>
@@ -2434,7 +2434,7 @@
           <w:sz w:val="21"/>
           <w:szCs w:val="21"/>
         </w:rPr>
-        <w:t>Severidad preliminar alta: podría reenviar confirmaciones de pedidos ajenos si se conoce un ID válido.</w:t>
+        <w:t>Le asigné severidad media: con un código de pedido conocido se podía activar una confirmación ajena, incluso repetidamente. El endpoint no devolvía el contenido del pedido al solicitante.</w:t>
       </w:r>
     </w:p>
     <w:p>
@@ -2442,7 +2442,7 @@
         <w:pBdr>
           <w:bottom w:val="single" w:color="C0C0C0" w:sz="4" w:space="4"/>
         </w:pBdr>
-        <w:spacing w:after="220" w:line="276"/>
+        <w:spacing w:after="120" w:line="276"/>
       </w:pPr>
       <w:r>
         <w:rPr>
@@ -2453,7 +2453,7 @@
           <w:sz w:val="21"/>
           <w:szCs w:val="21"/>
         </w:rPr>
-        <w:t>Falta comprobar en QA el impacto real y la facilidad de explotar el endpoint.</w:t>
+        <w:t>El identificador aleatorio dificulta adivinarlo, pero no sustituye autorización si el código se comparte o filtra. La explotación y el alcance en QA aún deben verificarse.</w:t>
       </w:r>
     </w:p>
     <w:p>
@@ -2478,7 +2478,7 @@
         <w:pBdr>
           <w:bottom w:val="single" w:color="C0C0C0" w:sz="4" w:space="4"/>
         </w:pBdr>
-        <w:spacing w:after="220" w:line="276"/>
+        <w:spacing w:after="120" w:line="276"/>
       </w:pPr>
       <w:r>
         <w:rPr>
@@ -2489,7 +2489,7 @@
           <w:sz w:val="21"/>
           <w:szCs w:val="21"/>
         </w:rPr>
-        <w:t>Aún no hay reporte del parche ni una prueba manual de QA. No puedo declarar un falso positivo todavía.</w:t>
+        <w:t>No atribuyo esta falla a un falso positivo. La prueba ejercitó la ruta y mostró 202 indebido; el pipeline local bloqueó por dos pruebas de autorización fallidas.</w:t>
       </w:r>
     </w:p>
     <w:p>
@@ -2497,7 +2497,7 @@
         <w:pBdr>
           <w:bottom w:val="single" w:color="C0C0C0" w:sz="4" w:space="4"/>
         </w:pBdr>
-        <w:spacing w:after="220" w:line="276"/>
+        <w:spacing w:after="120" w:line="276"/>
       </w:pPr>
       <w:r>
         <w:rPr>
@@ -2508,7 +2508,7 @@
           <w:sz w:val="21"/>
           <w:szCs w:val="21"/>
         </w:rPr>
-        <w:t>Al ejecutar el pipeline registraré cada aviso, su contexto y si la falla de autorización requiere una prueba específica además del análisis estático.</w:t>
+        <w:t>Bandit no detectó esa regla de negocio. Sus avisos medios permanecen en el reporte, pero ninguno explica el acceso a pedidos ajenos; la corrida QA todavía está pendiente.</w:t>
       </w:r>
     </w:p>
     <w:p>
@@ -2553,7 +2553,7 @@
         <w:pBdr>
           <w:bottom w:val="single" w:color="C0C0C0" w:sz="4" w:space="4"/>
         </w:pBdr>
-        <w:spacing w:after="220" w:line="276"/>
+        <w:spacing w:after="120" w:line="276"/>
       </w:pPr>
       <w:r>
         <w:rPr>
@@ -2564,7 +2564,7 @@
           <w:sz w:val="21"/>
           <w:szCs w:val="21"/>
         </w:rPr>
-        <w:t>Pendiente de ejecutar en QA. Mientras se prepara la remediación, el endpoint nuevo debe permanecer deshabilitado o inaccesible; no se ha aplicado aún una contención en AWS.</w:t>
+        <w:t>La versión vulnerable quedó como commit de prueba local y no se levantó como servicio público. Para QA indiqué ejecutarla solo como pipeline aislado, sin abrir puertos; falta confirmar esa contención en AWS.</w:t>
       </w:r>
     </w:p>
     <w:p>
@@ -2572,7 +2572,7 @@
         <w:pBdr>
           <w:bottom w:val="single" w:color="C0C0C0" w:sz="4" w:space="4"/>
         </w:pBdr>
-        <w:spacing w:after="220" w:line="276"/>
+        <w:spacing w:after="120" w:line="276"/>
       </w:pPr>
       <w:r>
         <w:rPr>
@@ -2583,7 +2583,7 @@
           <w:sz w:val="21"/>
           <w:szCs w:val="21"/>
         </w:rPr>
-        <w:t>La contención limitaría la exposición temporalmente, pero no sustituye la validación de autorización en el código.</w:t>
+        <w:t>No borré ni alteré pedidos reales para demostrarla: las pruebas locales usaron dobles de RDS y notificaciones. La contención no reemplaza el arreglo de autorización.</w:t>
       </w:r>
     </w:p>
     <w:p>
@@ -2608,7 +2608,7 @@
         <w:pBdr>
           <w:bottom w:val="single" w:color="C0C0C0" w:sz="4" w:space="4"/>
         </w:pBdr>
-        <w:spacing w:after="220" w:line="276"/>
+        <w:spacing w:after="120" w:line="276"/>
       </w:pPr>
       <w:r>
         <w:rPr>
@@ -2619,7 +2619,7 @@
           <w:sz w:val="21"/>
           <w:szCs w:val="21"/>
         </w:rPr>
-        <w:t>Pendiente de implementar y comprobar. El diseño de corrección exigirá sesión válida y comprobará que el pedido pertenece al usuario antes de reenviar.</w:t>
+        <w:t>Exigí sesión y comparación de orders.user_id con el usuario antes de notificar. Un pedido ajeno devuelve 404 sin evento, y una petición anónima devuelve 401; el propietario conserva el reenvío.</w:t>
       </w:r>
     </w:p>
     <w:p>
@@ -2627,7 +2627,7 @@
         <w:pBdr>
           <w:bottom w:val="single" w:color="C0C0C0" w:sz="4" w:space="4"/>
         </w:pBdr>
-        <w:spacing w:after="220" w:line="276"/>
+        <w:spacing w:after="120" w:line="276"/>
       </w:pPr>
       <w:r>
         <w:rPr>
@@ -2638,7 +2638,7 @@
           <w:sz w:val="21"/>
           <w:szCs w:val="21"/>
         </w:rPr>
-        <w:t>Mantendré el reenvío para pedidos propios y añadiré pruebas que rechacen pedidos ajenos o inexistentes; solo el código que pase el pipeline podrá ir a Producción.</w:t>
+        <w:t>Persistí el código público del pedido en RDS y tomé el correo de la cuenta autenticada. Probé casos propios, ajenos, anónimos y fallas; el pipeline local permitió la versión corregida. Falta validarla en QA.</w:t>
       </w:r>
     </w:p>
     <w:p>
@@ -2701,7 +2701,7 @@
         <w:pBdr>
           <w:bottom w:val="single" w:color="C0C0C0" w:sz="4" w:space="4"/>
         </w:pBdr>
-        <w:spacing w:after="220" w:line="276"/>
+        <w:spacing w:after="120" w:line="276"/>
       </w:pPr>
       <w:r>
         <w:rPr>
@@ -2712,7 +2712,7 @@
           <w:sz w:val="21"/>
           <w:szCs w:val="21"/>
         </w:rPr>
-        <w:t>Pendiente de completar después de integrar y probar el parche en QA; aún no sería honesto atribuirme una dificultad concreta de esta falla.</w:t>
+        <w:t>Lo más difícil fue unir el código BDK de la interfaz con la fila en RDS: antes no se guardaba y el parche no podía localizar el pedido.</w:t>
       </w:r>
     </w:p>
     <w:p>
@@ -2720,7 +2720,7 @@
         <w:pBdr>
           <w:bottom w:val="single" w:color="C0C0C0" w:sz="4" w:space="4"/>
         </w:pBdr>
-        <w:spacing w:after="220" w:line="276"/>
+        <w:spacing w:after="120" w:line="276"/>
       </w:pPr>
       <w:r>
         <w:rPr>
@@ -2731,12 +2731,13 @@
           <w:sz w:val="21"/>
           <w:szCs w:val="21"/>
         </w:rPr>
-        <w:t>Registraré el error más costoso, la evidencia que lo reveló y el cambio que lo resolvió.</w:t>
+        <w:t>Persistí el código con una migración idempotente y probé acceso con dos usuarios. Bandit no detectó esta falla de negocio; la prueba funcional sí.</w:t>
       </w:r>
     </w:p>
     <w:p>
       <w:pPr>
         <w:pStyle w:val="Heading2"/>
+        <w:keepNext/>
         <w:spacing w:after="120" w:before="280"/>
       </w:pPr>
       <w:r>
@@ -2756,7 +2757,7 @@
         <w:pBdr>
           <w:bottom w:val="single" w:color="C0C0C0" w:sz="4" w:space="4"/>
         </w:pBdr>
-        <w:spacing w:after="220" w:line="276"/>
+        <w:spacing w:after="120" w:line="276"/>
       </w:pPr>
       <w:r>
         <w:rPr>
@@ -2767,7 +2768,7 @@
           <w:sz w:val="21"/>
           <w:szCs w:val="21"/>
         </w:rPr>
-        <w:t>Si el incidente ocurriera con usuarios reales, primero limitaría el endpoint y revisaría registros para estimar el alcance antes de reactivarlo.</w:t>
+        <w:t>Aislaría la ruta, revisaría logs para medir el alcance y avisaría a los afectados. No asumiría éxito solo porque la API devuelva 202.</w:t>
       </w:r>
     </w:p>
     <w:p>
@@ -2775,7 +2776,7 @@
         <w:pBdr>
           <w:bottom w:val="single" w:color="C0C0C0" w:sz="4" w:space="4"/>
         </w:pBdr>
-        <w:spacing w:after="220" w:line="276"/>
+        <w:spacing w:after="120" w:line="276"/>
       </w:pPr>
       <w:r>
         <w:rPr>
@@ -2786,7 +2787,7 @@
           <w:sz w:val="21"/>
           <w:szCs w:val="21"/>
         </w:rPr>
-        <w:t>Después verificaría la autorización con pruebas de pedidos propios y ajenos, comunicaría el resultado según el impacto y desplegaría una versión corregida con monitoreo.</w:t>
+        <w:t>Desplegaría con pruebas de propiedad, monitoreo y correo verificable; sin SMTP indicaría que solo se registró un evento.</w:t>
       </w:r>
     </w:p>
     <w:sectPr>

</xml_diff>